<commit_message>
Separa "Búsqueda y exploración" de "Ficha de detalle" en documentos funcionales
El usuario notó que ningún documento abordaba puntualmente la experiencia
de búsqueda (listado, buscador, filtros, mapa) — estaba cubierta, pero
mezclada dentro de un único módulo "Propiedades" junto con la ficha de
detalle. Son dos experiencias funcionalmente distintas (descubrir vs.
profundizar en una propiedad puntual), así que se separan en dos
documentos:

  03. Búsqueda y exploración de propiedades (listado, buscador, filtros, mapa)
  04. Ficha de detalle de propiedad

Esto corre en +1 la numeración de todos los módulos siguientes (antes
04-13, ahora 05-14) — se renombran los archivos y se actualizan todas las
referencias cruzadas "ver Módulo N" dentro del contenido para que sigan
apuntando al módulo correcto.

Co-Authored-By: Claude Sonnet 5 <noreply@anthropic.com>
</commit_message>
<xml_diff>
--- a/docs/documentos-funcionales/02-inicio-home.docx
+++ b/docs/documentos-funcionales/02-inicio-home.docx
@@ -131,7 +131,7 @@
         <w:spacing w:after="90"/>
       </w:pPr>
       <w:r>
-        <w:t xml:space="preserve">Buscador con selector de tipo de propiedad + texto libre, que lleva al listado de Propiedades.</w:t>
+        <w:t xml:space="preserve">Buscador con selector de tipo de propiedad + texto libre, que lleva al listado de Propiedades (Módulo 3).</w:t>
       </w:r>
     </w:p>
     <w:p>
@@ -157,20 +157,20 @@
         <w:spacing w:after="90"/>
       </w:pPr>
       <w:r>
-        <w:t xml:space="preserve">Franja de accesos rápidos (3 cards) debajo del buscador — ver Módulo 13, hoy son solo visuales, sin contenido definido.</w:t>
-      </w:r>
-    </w:p>
-    <w:p>
-      <w:pPr>
-        <w:pStyle w:val="ListParagraph"/>
-        <w:numPr>
-          <w:ilvl w:val="0"/>
-          <w:numId w:val="2"/>
-        </w:numPr>
-        <w:spacing w:after="90"/>
-      </w:pPr>
-      <w:r>
-        <w:t xml:space="preserve">5 cards de "momentos", una por cada módulo de Academia BBVA (Módulo 8).</w:t>
+        <w:t xml:space="preserve">Franja de accesos rápidos (3 cards) debajo del buscador — ver Módulo 14, hoy son solo visuales, sin contenido definido.</w:t>
+      </w:r>
+    </w:p>
+    <w:p>
+      <w:pPr>
+        <w:pStyle w:val="ListParagraph"/>
+        <w:numPr>
+          <w:ilvl w:val="0"/>
+          <w:numId w:val="2"/>
+        </w:numPr>
+        <w:spacing w:after="90"/>
+      </w:pPr>
+      <w:r>
+        <w:t xml:space="preserve">5 cards de "momentos", una por cada módulo de Academia BBVA (Módulo 9).</w:t>
       </w:r>
     </w:p>
     <w:p>
@@ -196,7 +196,7 @@
         <w:spacing w:after="90"/>
       </w:pPr>
       <w:r>
-        <w:t xml:space="preserve">Sección de precios por zona (ver Módulo 11) y carrusel de "última oportunidad".</w:t>
+        <w:t xml:space="preserve">Sección de precios por zona (ver Módulo 12) y carrusel de "última oportunidad".</w:t>
       </w:r>
     </w:p>
     <w:p>
@@ -511,7 +511,7 @@
         <w:spacing w:after="90"/>
       </w:pPr>
       <w:r>
-        <w:t xml:space="preserve">Los 3 accesos rápidos no tienen destino/contenido definido (Módulo 13).</w:t>
+        <w:t xml:space="preserve">Los 3 accesos rápidos no tienen destino/contenido definido (Módulo 14).</w:t>
       </w:r>
     </w:p>
     <w:p>

</xml_diff>